<commit_message>
Align Winlink guide cover with N0JCG handbook branding
</commit_message>
<xml_diff>
--- a/docs/N0JCG_Winlink_Email_Server_End_User_Guide.docx
+++ b/docs/N0JCG_Winlink_Email_Server_End_User_Guide.docx
@@ -2,93 +2,6 @@
 <file path=word/document.xml><?xml version="1.0" encoding="utf-8"?>
 <w:document xmlns:wpc="http://schemas.microsoft.com/office/word/2010/wordprocessingCanvas" xmlns:mo="http://schemas.microsoft.com/office/mac/office/2008/main" xmlns:mc="http://schemas.openxmlformats.org/markup-compatibility/2006" xmlns:mv="urn:schemas-microsoft-com:mac:vml" xmlns:o="urn:schemas-microsoft-com:office:office" xmlns:r="http://schemas.openxmlformats.org/officeDocument/2006/relationships" xmlns:m="http://schemas.openxmlformats.org/officeDocument/2006/math" xmlns:v="urn:schemas-microsoft-com:vml" xmlns:wp14="http://schemas.microsoft.com/office/word/2010/wordprocessingDrawing" xmlns:wp="http://schemas.openxmlformats.org/drawingml/2006/wordprocessingDrawing" xmlns:w10="urn:schemas-microsoft-com:office:word" xmlns:w="http://schemas.openxmlformats.org/wordprocessingml/2006/main" xmlns:w14="http://schemas.microsoft.com/office/word/2010/wordml" xmlns:wpg="http://schemas.microsoft.com/office/word/2010/wordprocessingGroup" xmlns:wpi="http://schemas.microsoft.com/office/word/2010/wordprocessingInk" xmlns:wne="http://schemas.microsoft.com/office/word/2006/wordml" xmlns:wps="http://schemas.microsoft.com/office/word/2010/wordprocessingShape" mc:Ignorable="w14 wp14">
   <w:body>
-    <w:p>
-      <w:pPr>
-        <w:spacing w:before="760"/>
-        <w:jc w:val="center"/>
-      </w:pPr>
-      <w:r>
-        <w:drawing>
-          <wp:inline xmlns:a="http://schemas.openxmlformats.org/drawingml/2006/main" xmlns:pic="http://schemas.openxmlformats.org/drawingml/2006/picture">
-            <wp:extent cx="4023360" cy="766354"/>
-            <wp:docPr id="1" name="Picture 1"/>
-            <wp:cNvGraphicFramePr>
-              <a:graphicFrameLocks noChangeAspect="1"/>
-            </wp:cNvGraphicFramePr>
-            <a:graphic>
-              <a:graphicData uri="http://schemas.openxmlformats.org/drawingml/2006/picture">
-                <pic:pic>
-                  <pic:nvPicPr>
-                    <pic:cNvPr id="0" name="N0JCG_Header_Dark_Approved.png"/>
-                    <pic:cNvPicPr/>
-                  </pic:nvPicPr>
-                  <pic:blipFill>
-                    <a:blip r:embed="rId11"/>
-                    <a:stretch>
-                      <a:fillRect/>
-                    </a:stretch>
-                  </pic:blipFill>
-                  <pic:spPr>
-                    <a:xfrm>
-                      <a:off x="0" y="0"/>
-                      <a:ext cx="4023360" cy="766354"/>
-                    </a:xfrm>
-                    <a:prstGeom prst="rect"/>
-                  </pic:spPr>
-                </pic:pic>
-              </a:graphicData>
-            </a:graphic>
-          </wp:inline>
-        </w:drawing>
-      </w:r>
-    </w:p>
-    <w:p>
-      <w:pPr>
-        <w:spacing w:before="600"/>
-        <w:jc w:val="center"/>
-      </w:pPr>
-      <w:r>
-        <w:rPr>
-          <w:rFonts w:ascii="Aptos Display" w:hAnsi="Aptos Display"/>
-          <w:b/>
-          <w:i w:val="0"/>
-          <w:color w:val="0A1F44"/>
-          <w:sz w:val="48"/>
-        </w:rPr>
-        <w:t>N0JCG WINLINK EMAIL SERVER</w:t>
-      </w:r>
-    </w:p>
-    <w:p>
-      <w:pPr>
-        <w:jc w:val="center"/>
-      </w:pPr>
-      <w:r>
-        <w:rPr>
-          <w:rFonts w:ascii="Aptos Display" w:hAnsi="Aptos Display"/>
-          <w:b/>
-          <w:i w:val="0"/>
-          <w:color w:val="1565C0"/>
-          <w:sz w:val="34"/>
-        </w:rPr>
-        <w:t>End User Guide</w:t>
-      </w:r>
-    </w:p>
-    <w:p>
-      <w:pPr>
-        <w:spacing w:before="360"/>
-        <w:jc w:val="center"/>
-      </w:pPr>
-      <w:r>
-        <w:rPr>
-          <w:rFonts w:ascii="Aptos" w:hAnsi="Aptos"/>
-          <w:b w:val="0"/>
-          <w:i w:val="0"/>
-          <w:color w:val="536171"/>
-          <w:sz w:val="22"/>
-        </w:rPr>
-        <w:t>Client-side Winlink email for the N0JCG Open Radio Platform</w:t>
-      </w:r>
-    </w:p>
     <w:tbl>
       <w:tblPr>
         <w:tblW w:type="auto" w:w="0"/>
@@ -102,42 +15,299 @@
         <w:tc>
           <w:tcPr>
             <w:tcW w:type="dxa" w:w="9994"/>
-            <w:shd w:fill="E9FAFC"/>
+            <w:shd w:fill="0A1F44"/>
             <w:tcMar>
-              <w:top w:w="150" w:type="dxa"/>
-              <w:start w:w="180" w:type="dxa"/>
-              <w:bottom w:w="150" w:type="dxa"/>
-              <w:end w:w="180" w:type="dxa"/>
+              <w:top w:w="220" w:type="dxa"/>
+              <w:start w:w="220" w:type="dxa"/>
+              <w:bottom w:w="220" w:type="dxa"/>
+              <w:end w:w="220" w:type="dxa"/>
             </w:tcMar>
           </w:tcPr>
           <w:p>
             <w:pPr>
-              <w:spacing w:after="60"/>
+              <w:jc w:val="center"/>
             </w:pPr>
+            <w:r>
+              <w:drawing>
+                <wp:inline xmlns:a="http://schemas.openxmlformats.org/drawingml/2006/main" xmlns:pic="http://schemas.openxmlformats.org/drawingml/2006/picture">
+                  <wp:extent cx="4297680" cy="818606"/>
+                  <wp:docPr id="1" name="Picture 1"/>
+                  <wp:cNvGraphicFramePr>
+                    <a:graphicFrameLocks noChangeAspect="1"/>
+                  </wp:cNvGraphicFramePr>
+                  <a:graphic>
+                    <a:graphicData uri="http://schemas.openxmlformats.org/drawingml/2006/picture">
+                      <pic:pic>
+                        <pic:nvPicPr>
+                          <pic:cNvPr id="0" name="N0JCG_Header_Dark_Approved.png"/>
+                          <pic:cNvPicPr/>
+                        </pic:nvPicPr>
+                        <pic:blipFill>
+                          <a:blip r:embed="rId13"/>
+                          <a:stretch>
+                            <a:fillRect/>
+                          </a:stretch>
+                        </pic:blipFill>
+                        <pic:spPr>
+                          <a:xfrm>
+                            <a:off x="0" y="0"/>
+                            <a:ext cx="4297680" cy="818606"/>
+                          </a:xfrm>
+                          <a:prstGeom prst="rect"/>
+                        </pic:spPr>
+                      </pic:pic>
+                    </a:graphicData>
+                  </a:graphic>
+                </wp:inline>
+              </w:drawing>
+            </w:r>
+          </w:p>
+        </w:tc>
+      </w:tr>
+    </w:tbl>
+    <w:p>
+      <w:pPr>
+        <w:spacing w:after="520"/>
+      </w:pPr>
+    </w:p>
+    <w:p>
+      <w:pPr>
+        <w:spacing w:after="240"/>
+        <w:jc w:val="center"/>
+      </w:pPr>
+      <w:r>
+        <w:rPr>
+          <w:rFonts w:ascii="Aptos Display" w:hAnsi="Aptos Display"/>
+          <w:b/>
+          <w:i w:val="0"/>
+          <w:color w:val="00B8D9"/>
+          <w:sz w:val="21"/>
+        </w:rPr>
+        <w:t>OPERATOR HANDBOOK</w:t>
+      </w:r>
+    </w:p>
+    <w:p>
+      <w:pPr>
+        <w:spacing w:after="160"/>
+        <w:jc w:val="center"/>
+      </w:pPr>
+      <w:r>
+        <w:rPr>
+          <w:rFonts w:ascii="Aptos Display" w:hAnsi="Aptos Display"/>
+          <w:b/>
+          <w:i w:val="0"/>
+          <w:color w:val="0A1F44"/>
+          <w:sz w:val="50"/>
+        </w:rPr>
+        <w:t>N0JCG Winlink Email Server</w:t>
+      </w:r>
+    </w:p>
+    <w:p>
+      <w:pPr>
+        <w:spacing w:after="240"/>
+        <w:jc w:val="center"/>
+      </w:pPr>
+      <w:r>
+        <w:rPr>
+          <w:rFonts w:ascii="Aptos" w:hAnsi="Aptos"/>
+          <w:b w:val="0"/>
+          <w:i w:val="0"/>
+          <w:color w:val="536171"/>
+          <w:sz w:val="26"/>
+        </w:rPr>
+        <w:t>Installation, client setup, webmail operation, and troubleshooting</w:t>
+      </w:r>
+    </w:p>
+    <w:p>
+      <w:pPr>
+        <w:spacing w:before="360" w:after="400"/>
+        <w:pBdr>
+          <w:bottom w:val="single" w:sz="14" w:space="1" w:color="00B8D9"/>
+        </w:pBdr>
+      </w:pPr>
+    </w:p>
+    <w:p>
+      <w:pPr>
+        <w:spacing w:after="520"/>
+        <w:jc w:val="center"/>
+      </w:pPr>
+      <w:r>
+        <w:rPr>
+          <w:rFonts w:ascii="Aptos" w:hAnsi="Aptos"/>
+          <w:b w:val="0"/>
+          <w:i w:val="0"/>
+          <w:color w:val="0A1F44"/>
+          <w:sz w:val="22"/>
+        </w:rPr>
+        <w:t>A complete guide to the Raspberry Pi client appliance, Winlink mailbox access, DigiRig Mobile integration, and safe Packet RMS operation.</w:t>
+      </w:r>
+    </w:p>
+    <w:tbl>
+      <w:tblPr>
+        <w:tblW w:type="auto" w:w="0"/>
+        <w:tblLayout w:type="fixed"/>
+        <w:tblLook w:firstColumn="1" w:firstRow="1" w:lastColumn="0" w:lastRow="0" w:noHBand="0" w:noVBand="1" w:val="04A0"/>
+      </w:tblPr>
+      <w:tblGrid>
+        <w:gridCol w:w="4997"/>
+        <w:gridCol w:w="4997"/>
+      </w:tblGrid>
+      <w:tr>
+        <w:tc>
+          <w:tcPr>
+            <w:tcW w:type="dxa" w:w="4925"/>
+            <w:shd w:fill="0A1F44"/>
+            <w:tcMar>
+              <w:top w:w="100" w:type="dxa"/>
+              <w:start w:w="120" w:type="dxa"/>
+              <w:bottom w:w="100" w:type="dxa"/>
+              <w:end w:w="120" w:type="dxa"/>
+            </w:tcMar>
+            <w:vAlign w:val="center"/>
+          </w:tcPr>
+          <w:p>
             <w:r>
               <w:rPr>
                 <w:rFonts w:ascii="Aptos" w:hAnsi="Aptos"/>
                 <w:b/>
                 <w:i w:val="0"/>
-                <w:color w:val="0A1F44"/>
-                <w:sz w:val="21"/>
+                <w:color w:val="FFFFFF"/>
+                <w:sz w:val="18"/>
               </w:rPr>
-              <w:t>PRODUCT ROLE</w:t>
+              <w:t>Release</w:t>
             </w:r>
           </w:p>
+        </w:tc>
+        <w:tc>
+          <w:tcPr>
+            <w:tcW w:type="dxa" w:w="4925"/>
+            <w:shd w:fill="0A1F44"/>
+            <w:tcMar>
+              <w:top w:w="100" w:type="dxa"/>
+              <w:start w:w="120" w:type="dxa"/>
+              <w:bottom w:w="100" w:type="dxa"/>
+              <w:end w:w="120" w:type="dxa"/>
+            </w:tcMar>
+            <w:vAlign w:val="center"/>
+          </w:tcPr>
           <w:p>
-            <w:pPr>
-              <w:spacing w:after="0"/>
-            </w:pPr>
+            <w:r>
+              <w:rPr>
+                <w:rFonts w:ascii="Aptos" w:hAnsi="Aptos"/>
+                <w:b/>
+                <w:i w:val="0"/>
+                <w:color w:val="FFFFFF"/>
+                <w:sz w:val="18"/>
+              </w:rPr>
+              <w:t>Publication</w:t>
+            </w:r>
+          </w:p>
+        </w:tc>
+      </w:tr>
+      <w:tr>
+        <w:tc>
+          <w:tcPr>
+            <w:tcW w:type="dxa" w:w="4925"/>
+            <w:shd w:fill="F4F7FA"/>
+            <w:tcMar>
+              <w:top w:w="100" w:type="dxa"/>
+              <w:start w:w="120" w:type="dxa"/>
+              <w:bottom w:w="100" w:type="dxa"/>
+              <w:end w:w="120" w:type="dxa"/>
+            </w:tcMar>
+            <w:vAlign w:val="center"/>
+          </w:tcPr>
+          <w:p>
             <w:r>
               <w:rPr>
                 <w:rFonts w:ascii="Aptos" w:hAnsi="Aptos"/>
                 <w:b w:val="0"/>
                 <w:i w:val="0"/>
                 <w:color w:val="0A1F44"/>
-                <w:sz w:val="20"/>
+                <w:sz w:val="19"/>
               </w:rPr>
-              <w:t>A Raspberry Pi client appliance for private Winlink mailbox access through an external Packet RMS gateway. The appliance is not an RMS gateway.</w:t>
+              <w:t>0.1.0</w:t>
+            </w:r>
+          </w:p>
+        </w:tc>
+        <w:tc>
+          <w:tcPr>
+            <w:tcW w:type="dxa" w:w="4925"/>
+            <w:shd w:fill="F4F7FA"/>
+            <w:tcMar>
+              <w:top w:w="100" w:type="dxa"/>
+              <w:start w:w="120" w:type="dxa"/>
+              <w:bottom w:w="100" w:type="dxa"/>
+              <w:end w:w="120" w:type="dxa"/>
+            </w:tcMar>
+            <w:vAlign w:val="center"/>
+          </w:tcPr>
+          <w:p>
+            <w:r>
+              <w:rPr>
+                <w:rFonts w:ascii="Aptos" w:hAnsi="Aptos"/>
+                <w:b w:val="0"/>
+                <w:i w:val="0"/>
+                <w:color w:val="0A1F44"/>
+                <w:sz w:val="19"/>
+              </w:rPr>
+              <w:t>August 2026</w:t>
+            </w:r>
+          </w:p>
+        </w:tc>
+      </w:tr>
+      <w:tr>
+        <w:tc>
+          <w:tcPr>
+            <w:tcW w:type="dxa" w:w="4925"/>
+            <w:shd w:fill="FFFFFF"/>
+            <w:tcMar>
+              <w:top w:w="100" w:type="dxa"/>
+              <w:start w:w="120" w:type="dxa"/>
+              <w:bottom w:w="100" w:type="dxa"/>
+              <w:end w:w="120" w:type="dxa"/>
+            </w:tcMar>
+            <w:vAlign w:val="center"/>
+          </w:tcPr>
+          <w:p>
+            <w:r>
+              <w:rPr>
+                <w:rFonts w:ascii="Aptos" w:hAnsi="Aptos"/>
+                <w:b w:val="0"/>
+                <w:i w:val="0"/>
+                <w:color w:val="0A1F44"/>
+                <w:sz w:val="19"/>
+              </w:rPr>
+              <w:t>PRODUCT ROLE</w:t>
+              <w:br/>
+              <w:t>Client-side Winlink email</w:t>
+            </w:r>
+          </w:p>
+        </w:tc>
+        <w:tc>
+          <w:tcPr>
+            <w:tcW w:type="dxa" w:w="4925"/>
+            <w:shd w:fill="FFFFFF"/>
+            <w:tcMar>
+              <w:top w:w="100" w:type="dxa"/>
+              <w:start w:w="120" w:type="dxa"/>
+              <w:bottom w:w="100" w:type="dxa"/>
+              <w:end w:w="120" w:type="dxa"/>
+            </w:tcMar>
+            <w:vAlign w:val="center"/>
+          </w:tcPr>
+          <w:p>
+            <w:r>
+              <w:rPr>
+                <w:rFonts w:ascii="Aptos" w:hAnsi="Aptos"/>
+                <w:b w:val="0"/>
+                <w:i w:val="0"/>
+                <w:color w:val="0A1F44"/>
+                <w:sz w:val="19"/>
+              </w:rPr>
+              <w:t>AUDIENCE</w:t>
+              <w:br/>
+              <w:t>Operators and mailbox users</w:t>
             </w:r>
           </w:p>
         </w:tc>
@@ -147,22 +317,6 @@
       <w:pPr>
         <w:spacing w:after="0"/>
       </w:pPr>
-    </w:p>
-    <w:p>
-      <w:pPr>
-        <w:spacing w:before="2900"/>
-        <w:jc w:val="center"/>
-      </w:pPr>
-      <w:r>
-        <w:rPr>
-          <w:rFonts w:ascii="Aptos" w:hAnsi="Aptos"/>
-          <w:b w:val="0"/>
-          <w:i w:val="0"/>
-          <w:color w:val="536171"/>
-          <w:sz w:val="18"/>
-        </w:rPr>
-        <w:t>Version 1.0  |  Host role: PI-WINLINK</w:t>
-      </w:r>
     </w:p>
     <w:p>
       <w:r>
@@ -1334,7 +1488,7 @@
                     <pic:cNvPicPr/>
                   </pic:nvPicPr>
                   <pic:blipFill>
-                    <a:blip r:embed="rId12"/>
+                    <a:blip r:embed="rId14"/>
                     <a:stretch>
                       <a:fillRect/>
                     </a:stretch>
@@ -1415,7 +1569,7 @@
                     <pic:cNvPicPr/>
                   </pic:nvPicPr>
                   <pic:blipFill>
-                    <a:blip r:embed="rId13"/>
+                    <a:blip r:embed="rId15"/>
                     <a:stretch>
                       <a:fillRect/>
                     </a:stretch>
@@ -2469,11 +2623,14 @@
       </w:pPr>
     </w:p>
     <w:sectPr>
-      <w:headerReference w:type="default" r:id="rId9"/>
-      <w:footerReference w:type="default" r:id="rId10"/>
+      <w:headerReference w:type="first" r:id="rId9"/>
+      <w:headerReference w:type="default" r:id="rId10"/>
+      <w:footerReference w:type="first" r:id="rId11"/>
+      <w:footerReference w:type="default" r:id="rId12"/>
       <w:pgSz w:w="12240" w:h="15840"/>
       <w:pgMar w:top="1037" w:right="1123" w:bottom="1037" w:left="1123" w:header="461" w:footer="461" w:gutter="0"/>
       <w:cols w:space="720"/>
+      <w:titlePg/>
       <w:docGrid w:linePitch="360"/>
     </w:sectPr>
   </w:body>
@@ -2485,6 +2642,30 @@
   <w:p>
     <w:pPr>
       <w:pStyle w:val="Footer"/>
+      <w:jc w:val="right"/>
+      <w:pBdr>
+        <w:bottom w:val="single" w:sz="12" w:space="5" w:color="00B8D9"/>
+      </w:pBdr>
+    </w:pPr>
+    <w:r>
+      <w:rPr>
+        <w:rFonts w:ascii="Aptos" w:hAnsi="Aptos"/>
+        <w:b w:val="0"/>
+        <w:i w:val="0"/>
+        <w:color w:val="536171"/>
+        <w:sz w:val="16"/>
+      </w:rPr>
+      <w:t>N0JCG Open Radio Platform  |  N0JCG Winlink Email Server v0.1.0    Page 1</w:t>
+    </w:r>
+  </w:p>
+</w:ftr>
+</file>
+
+<file path=word/footer2.xml><?xml version="1.0" encoding="utf-8"?>
+<w:ftr xmlns:m="http://schemas.openxmlformats.org/officeDocument/2006/math" xmlns:mc="http://schemas.openxmlformats.org/markup-compatibility/2006" xmlns:mo="http://schemas.microsoft.com/office/mac/office/2008/main" xmlns:mv="urn:schemas-microsoft-com:mac:vml" xmlns:o="urn:schemas-microsoft-com:office:office" xmlns:r="http://schemas.openxmlformats.org/officeDocument/2006/relationships" xmlns:v="urn:schemas-microsoft-com:vml" xmlns:w10="urn:schemas-microsoft-com:office:word" xmlns:w14="http://schemas.microsoft.com/office/word/2010/wordml" xmlns:w="http://schemas.openxmlformats.org/wordprocessingml/2006/main" xmlns:wne="http://schemas.microsoft.com/office/word/2006/wordml" xmlns:wp14="http://schemas.microsoft.com/office/word/2010/wordprocessingDrawing" xmlns:wp="http://schemas.openxmlformats.org/drawingml/2006/wordprocessingDrawing" xmlns:wpc="http://schemas.microsoft.com/office/word/2010/wordprocessingCanvas" xmlns:wpg="http://schemas.microsoft.com/office/word/2010/wordprocessingGroup" xmlns:wpi="http://schemas.microsoft.com/office/word/2010/wordprocessingInk" xmlns:wps="http://schemas.microsoft.com/office/word/2010/wordprocessingShape" mc:Ignorable="w14 wp14">
+  <w:p>
+    <w:pPr>
+      <w:pStyle w:val="Footer"/>
       <w:jc w:val="center"/>
     </w:pPr>
     <w:r>
@@ -2502,6 +2683,17 @@
 </file>
 
 <file path=word/header1.xml><?xml version="1.0" encoding="utf-8"?>
+<w:hdr xmlns:m="http://schemas.openxmlformats.org/officeDocument/2006/math" xmlns:mc="http://schemas.openxmlformats.org/markup-compatibility/2006" xmlns:mo="http://schemas.microsoft.com/office/mac/office/2008/main" xmlns:mv="urn:schemas-microsoft-com:mac:vml" xmlns:o="urn:schemas-microsoft-com:office:office" xmlns:r="http://schemas.openxmlformats.org/officeDocument/2006/relationships" xmlns:v="urn:schemas-microsoft-com:vml" xmlns:w10="urn:schemas-microsoft-com:office:word" xmlns:w14="http://schemas.microsoft.com/office/word/2010/wordml" xmlns:w="http://schemas.openxmlformats.org/wordprocessingml/2006/main" xmlns:wne="http://schemas.microsoft.com/office/word/2006/wordml" xmlns:wp14="http://schemas.microsoft.com/office/word/2010/wordprocessingDrawing" xmlns:wp="http://schemas.openxmlformats.org/drawingml/2006/wordprocessingDrawing" xmlns:wpc="http://schemas.microsoft.com/office/word/2010/wordprocessingCanvas" xmlns:wpg="http://schemas.microsoft.com/office/word/2010/wordprocessingGroup" xmlns:wpi="http://schemas.microsoft.com/office/word/2010/wordprocessingInk" xmlns:wps="http://schemas.microsoft.com/office/word/2010/wordprocessingShape" mc:Ignorable="w14 wp14">
+  <w:p>
+    <w:pPr>
+      <w:pStyle w:val="Header"/>
+    </w:pPr>
+    <w:r/>
+  </w:p>
+</w:hdr>
+</file>
+
+<file path=word/header2.xml><?xml version="1.0" encoding="utf-8"?>
 <w:hdr xmlns:m="http://schemas.openxmlformats.org/officeDocument/2006/math" xmlns:mc="http://schemas.openxmlformats.org/markup-compatibility/2006" xmlns:mo="http://schemas.microsoft.com/office/mac/office/2008/main" xmlns:mv="urn:schemas-microsoft-com:mac:vml" xmlns:o="urn:schemas-microsoft-com:office:office" xmlns:r="http://schemas.openxmlformats.org/officeDocument/2006/relationships" xmlns:v="urn:schemas-microsoft-com:vml" xmlns:w10="urn:schemas-microsoft-com:office:word" xmlns:w14="http://schemas.microsoft.com/office/word/2010/wordml" xmlns:w="http://schemas.openxmlformats.org/wordprocessingml/2006/main" xmlns:wne="http://schemas.microsoft.com/office/word/2006/wordml" xmlns:wp14="http://schemas.microsoft.com/office/word/2010/wordprocessingDrawing" xmlns:wp="http://schemas.openxmlformats.org/drawingml/2006/wordprocessingDrawing" xmlns:wpc="http://schemas.microsoft.com/office/word/2010/wordprocessingCanvas" xmlns:wpg="http://schemas.microsoft.com/office/word/2010/wordprocessingGroup" xmlns:wpi="http://schemas.microsoft.com/office/word/2010/wordprocessingInk" xmlns:wps="http://schemas.microsoft.com/office/word/2010/wordprocessingShape" mc:Ignorable="w14 wp14">
   <w:p>
     <w:pPr>

</xml_diff>

<commit_message>
Add Wi-Fi fallback, USB gadget, and mobile layouts
</commit_message>
<xml_diff>
--- a/docs/N0JCG_Winlink_Email_Server_End_User_Guide.docx
+++ b/docs/N0JCG_Winlink_Email_Server_End_User_Guide.docx
@@ -1225,6 +1225,39 @@
         <w:t>During the initial install, the installer asks for an Nginx operator-console username, password, and password confirmation. Existing operator authentication is preserved during normal upgrades.</w:t>
       </w:r>
     </w:p>
+    <w:p>
+      <w:pPr>
+        <w:pStyle w:val="Heading2"/>
+      </w:pPr>
+      <w:r>
+        <w:t>Wi-Fi, hotspot fallback, and USB gadget</w:t>
+      </w:r>
+    </w:p>
+    <w:p>
+      <w:r>
+        <w:t>To configure connectivity during deployment, add --configure-connectivity. The helper prompts for the preferred Wi-Fi SSID/password and confirms the fallback hotspot password. The Pi uses Wi-Fi when it receives a DHCP address; otherwise it activates the secured N0JCG-WINLINK-SETUP hotspot with DHCP at 192.168.50.1.</w:t>
+      </w:r>
+    </w:p>
+    <w:p>
+      <w:pPr>
+        <w:shd w:fill="0A1F44"/>
+      </w:pPr>
+      <w:r>
+        <w:rPr>
+          <w:rFonts w:ascii="Consolas" w:hAnsi="Consolas"/>
+          <w:b w:val="0"/>
+          <w:i w:val="0"/>
+          <w:color w:val="FFFFFF"/>
+          <w:sz w:val="20"/>
+        </w:rPr>
+        <w:t>./deploy/push_to_pi.sh 192.168.68.149 pi --configure-connectivity</w:t>
+      </w:r>
+    </w:p>
+    <w:p>
+      <w:r>
+        <w:t>The Pi 4 USB Ethernet gadget is available at 192.168.77.1 through the USB-C power/data port. The blue USB host ports are not gadget ports.</w:t>
+      </w:r>
+    </w:p>
     <w:tbl>
       <w:tblPr>
         <w:tblW w:type="auto" w:w="0"/>
@@ -1807,7 +1840,7 @@
           <w:color w:val="0A1F44"/>
           <w:sz w:val="21"/>
         </w:rPr>
-        <w:t>Power the radio, DigiRig Mobile, and Raspberry Pi.</w:t>
+        <w:t>Keep the Pi 4 USB-C power/data port available for the USB Ethernet gadget; it is not a DigiRig host port.</w:t>
       </w:r>
     </w:p>
     <w:p>
@@ -1833,7 +1866,7 @@
           <w:color w:val="0A1F44"/>
           <w:sz w:val="21"/>
         </w:rPr>
-        <w:t>Confirm the operator console reports expected USB/audio/serial devices as Detected.</w:t>
+        <w:t>Power the radio, DigiRig Mobile, and Raspberry Pi.</w:t>
       </w:r>
     </w:p>
     <w:p>
@@ -1859,7 +1892,7 @@
           <w:color w:val="0A1F44"/>
           <w:sz w:val="21"/>
         </w:rPr>
-        <w:t>Configure the radio profile, audio levels, PTT method, and selected Packet RMS gateway.</w:t>
+        <w:t>Confirm the operator console reports expected USB/audio/serial devices as Detected.</w:t>
       </w:r>
     </w:p>
     <w:p>
@@ -1885,6 +1918,32 @@
           <w:color w:val="0A1F44"/>
           <w:sz w:val="21"/>
         </w:rPr>
+        <w:t>Configure the radio profile, audio levels, PTT method, and selected Packet RMS gateway.</w:t>
+      </w:r>
+    </w:p>
+    <w:p>
+      <w:pPr>
+        <w:spacing w:after="100"/>
+        <w:ind w:left="461" w:hanging="461"/>
+      </w:pPr>
+      <w:r>
+        <w:rPr>
+          <w:rFonts w:ascii="Aptos" w:hAnsi="Aptos"/>
+          <w:b/>
+          <w:i w:val="0"/>
+          <w:color w:val="00B8D9"/>
+          <w:sz w:val="21"/>
+        </w:rPr>
+        <w:t xml:space="preserve">8.  </w:t>
+      </w:r>
+      <w:r>
+        <w:rPr>
+          <w:rFonts w:ascii="Aptos" w:hAnsi="Aptos"/>
+          <w:b w:val="0"/>
+          <w:i w:val="0"/>
+          <w:color w:val="0A1F44"/>
+          <w:sz w:val="21"/>
+        </w:rPr>
         <w:t>Perform receive-only checks before enabling transmit behavior.</w:t>
       </w:r>
     </w:p>
@@ -1901,7 +1960,7 @@
           <w:color w:val="00B8D9"/>
           <w:sz w:val="21"/>
         </w:rPr>
-        <w:t xml:space="preserve">8.  </w:t>
+        <w:t xml:space="preserve">9.  </w:t>
       </w:r>
       <w:r>
         <w:rPr>

</xml_diff>

<commit_message>
Adjust hotspot DHCP and USB gadget addresses
</commit_message>
<xml_diff>
--- a/docs/N0JCG_Winlink_Email_Server_End_User_Guide.docx
+++ b/docs/N0JCG_Winlink_Email_Server_End_User_Guide.docx
@@ -1235,7 +1235,7 @@
     </w:p>
     <w:p>
       <w:r>
-        <w:t>To configure connectivity during deployment, add --configure-connectivity. The helper prompts for the preferred Wi-Fi SSID/password and confirms the fallback hotspot password. The Pi uses Wi-Fi when it receives a DHCP address; otherwise it activates the secured N0JCG-WINLINK-SETUP hotspot with DHCP at 192.168.50.1.</w:t>
+        <w:t>To configure connectivity during deployment, add --configure-connectivity. The helper prompts for the preferred Wi-Fi SSID/password and confirms the fallback hotspot password. The Pi uses Wi-Fi when it receives a DHCP address; otherwise it activates the secured N0JCG-WINLINK-SETUP hotspot at 192.168.50.1 with leases from 192.168.50.100 through 192.168.50.200.</w:t>
       </w:r>
     </w:p>
     <w:p>
@@ -1255,7 +1255,7 @@
     </w:p>
     <w:p>
       <w:r>
-        <w:t>The Pi 4 USB Ethernet gadget is available at 192.168.77.1 through the USB-C power/data port. The blue USB host ports are not gadget ports.</w:t>
+        <w:t>The Pi 4 USB Ethernet gadget is available at 192.168.60.1 through the USB-C power/data port. The blue USB host ports are not gadget ports.</w:t>
       </w:r>
     </w:p>
     <w:tbl>

</xml_diff>

<commit_message>
Serve appliance web UI on port 80
</commit_message>
<xml_diff>
--- a/docs/N0JCG_Winlink_Email_Server_End_User_Guide.docx
+++ b/docs/N0JCG_Winlink_Email_Server_End_User_Guide.docx
@@ -555,7 +555,7 @@
                 <w:color w:val="0A1F44"/>
                 <w:sz w:val="19"/>
               </w:rPr>
-              <w:t>http://PI-IP:8096/ui/</w:t>
+              <w:t>http://PI-IP/ui/</w:t>
             </w:r>
           </w:p>
         </w:tc>
@@ -632,7 +632,7 @@
                 <w:color w:val="0A1F44"/>
                 <w:sz w:val="19"/>
               </w:rPr>
-              <w:t>http://PI-IP:8096/webmail/</w:t>
+              <w:t>http://PI-IP/webmail/</w:t>
             </w:r>
           </w:p>
         </w:tc>
@@ -1348,7 +1348,7 @@
           <w:color w:val="0A1F44"/>
           <w:sz w:val="21"/>
         </w:rPr>
-        <w:t>Open http://PI-IP:8096/ui/ from a workstation on the same network.</w:t>
+        <w:t>Open http://PI-IP/ui/ from a workstation on the same network.</w:t>
       </w:r>
     </w:p>
     <w:p>
@@ -1374,7 +1374,7 @@
           <w:color w:val="0A1F44"/>
           <w:sz w:val="21"/>
         </w:rPr>
-        <w:t>Open http://PI-IP:8096/webmail/.</w:t>
+        <w:t>Open http://PI-IP/webmail/.</w:t>
       </w:r>
     </w:p>
     <w:p>
@@ -2351,7 +2351,7 @@
                 <w:color w:val="0A1F44"/>
                 <w:sz w:val="19"/>
               </w:rPr>
-              <w:t>http://PI-IP:8096/ui/</w:t>
+              <w:t>http://PI-IP/ui/</w:t>
             </w:r>
           </w:p>
         </w:tc>
@@ -2403,7 +2403,7 @@
                 <w:color w:val="0A1F44"/>
                 <w:sz w:val="19"/>
               </w:rPr>
-              <w:t>http://PI-IP:8096/webmail/</w:t>
+              <w:t>http://PI-IP/webmail/</w:t>
             </w:r>
           </w:p>
         </w:tc>

</xml_diff>

<commit_message>
Release N0JCG Winlink Email Server v0.1.1
</commit_message>
<xml_diff>
--- a/docs/N0JCG_Winlink_Email_Server_End_User_Guide.docx
+++ b/docs/N0JCG_Winlink_Email_Server_End_User_Guide.docx
@@ -226,7 +226,7 @@
                 <w:color w:val="0A1F44"/>
                 <w:sz w:val="19"/>
               </w:rPr>
-              <w:t>0.1.0</w:t>
+              <w:t>0.1.1</w:t>
             </w:r>
           </w:p>
         </w:tc>
@@ -1439,7 +1439,7 @@
     </w:p>
     <w:p>
       <w:r>
-        <w:t>Open the webmail address and select Sign in with Winlink. Enter the user’s Winlink email address and secure-login password. The appliance validates the credentials against Winlink before opening the private local mailbox for that callsign.</w:t>
+        <w:t>Open the webmail address and select Sign in with Winlink. Enter the user’s Winlink email address and secure-login password. The appliance validates the credentials against Winlink before opening the private local mailbox for that callsign. Webmail remains closed until Winlink CMS secure login is accepted; failed or timed-out authentication never opens a session or mailbox.</w:t>
       </w:r>
     </w:p>
     <w:tbl>
@@ -1574,12 +1574,12 @@
         <w:pStyle w:val="Heading2"/>
       </w:pPr>
       <w:r>
-        <w:t>Compose a message</w:t>
+        <w:t>Compose, templates, and drafts</w:t>
       </w:r>
     </w:p>
     <w:p>
       <w:r>
-        <w:t>Select New message to open a blank form. Enter the Winlink recipient, subject, and message body. Select Save draft when work should remain local, or use the send control when the operator has enabled a verified transport path.</w:t>
+        <w:t>Select Compose to open a blank form. At the top of the form, use Choose template to select an installed Winlink Standard Form, complete its fields, and insert an editable message. The Signature control is beside Choose template. Enter the Winlink recipient, subject, and message body. Select Save draft when work should remain local, or queue the message when the operator has enabled a verified transport path.</w:t>
       </w:r>
     </w:p>
     <w:p>
@@ -1659,7 +1659,7 @@
           <w:color w:val="0A1F44"/>
           <w:sz w:val="21"/>
         </w:rPr>
-        <w:t>The Drafts counter updates after saving. Open a draft to continue editing or delete it from the Drafts panel.</w:t>
+        <w:t>The Drafts counter updates after saving. Open a draft to continue editing; queuing an opened draft removes it from Drafts and places it in Send queue.</w:t>
       </w:r>
     </w:p>
     <w:p>
@@ -1723,7 +1723,20 @@
     </w:p>
     <w:p>
       <w:r>
-        <w:t>Custom folders are shown indented under Inbox. Create and delete folders from Manage folders, then drag an Inbox message onto a folder to organize it.</w:t>
+        <w:t>Custom folders are shown indented under Inbox. Create and delete folders from Manage folders, then drag an Inbox message onto a folder to organize it. Moving a message removes it from its original folder. Opening a message marks it read. Inbox, Sent, and custom folders provide checkboxes for bulk Mark selected read and Delete selected actions.</w:t>
+      </w:r>
+    </w:p>
+    <w:p>
+      <w:pPr>
+        <w:pStyle w:val="Heading2"/>
+      </w:pPr>
+      <w:r>
+        <w:t>Send queue and automatic synchronization</w:t>
+      </w:r>
+    </w:p>
+    <w:p>
+      <w:r>
+        <w:t>Queue message stages the message into Pat’s official outbox and immediately starts a Packet RMS synchronization. The Send queue shows queued, staged, and transmission state. After a successful send, the message is removed from Send queue and its counter updates automatically. The operator configures automatic mailbox synchronization in the operator console under Packet station → Automatic mailbox sync (minutes), from 5 to 1440 minutes; the default is 30 minutes.</w:t>
       </w:r>
     </w:p>
     <w:p>
@@ -2068,7 +2081,7 @@
     </w:p>
     <w:p>
       <w:r>
-        <w:t>This means the Winlink account was authenticated, but the local mailbox service is not currently available. It is not a request for the user to type a command. Connect the radio and run a mailbox synchronization, then select Refresh. If the message persists, the operator should review the client service and diagnostics.</w:t>
+        <w:t>This means the Winlink account was authenticated, but the local mailbox service is not currently available. It is not a request for the user to type a command. Connect the radio and select Refresh to start a mailbox synchronization. If the message persists, the operator should review the client service and diagnostics.</w:t>
       </w:r>
     </w:p>
     <w:p>
@@ -2076,12 +2089,12 @@
         <w:pStyle w:val="Heading2"/>
       </w:pPr>
       <w:r>
-        <w:t>Login fails</w:t>
+        <w:t>Login fails or remains on Validating through the Winlink client…</w:t>
       </w:r>
     </w:p>
     <w:p>
       <w:r>
-        <w:t>Confirm the Winlink address and secure-login password. Check the Pi network connection and system time. Repeated failed attempts are rate-limited for protection.</w:t>
+        <w:t>Confirm the Winlink address and secure-login password. Check the Pi network connection, radio power, DigiRig cabling, frequency, packet station ID, RMS target, and system time. The login screen intentionally remains open until secure login is accepted; no mailbox is exposed during this wait. A failed RF exchange returns the user to the login screen. Repeated failed attempts are rate-limited for protection.</w:t>
       </w:r>
     </w:p>
     <w:p>
@@ -2616,6 +2629,110 @@
           </w:p>
         </w:tc>
       </w:tr>
+      <w:tr>
+        <w:tc>
+          <w:tcPr>
+            <w:tcW w:type="dxa" w:w="3024"/>
+            <w:shd w:fill="F4F7FA"/>
+            <w:tcMar>
+              <w:top w:w="100" w:type="dxa"/>
+              <w:start w:w="120" w:type="dxa"/>
+              <w:bottom w:w="100" w:type="dxa"/>
+              <w:end w:w="120" w:type="dxa"/>
+            </w:tcMar>
+            <w:vAlign w:val="center"/>
+          </w:tcPr>
+          <w:p>
+            <w:r>
+              <w:rPr>
+                <w:rFonts w:ascii="Aptos" w:hAnsi="Aptos"/>
+                <w:b w:val="0"/>
+                <w:i w:val="0"/>
+                <w:color w:val="0A1F44"/>
+                <w:sz w:val="19"/>
+              </w:rPr>
+              <w:t>Automatic mailbox sync</w:t>
+            </w:r>
+          </w:p>
+        </w:tc>
+        <w:tc>
+          <w:tcPr>
+            <w:tcW w:type="dxa" w:w="6768"/>
+            <w:shd w:fill="F4F7FA"/>
+            <w:tcMar>
+              <w:top w:w="100" w:type="dxa"/>
+              <w:start w:w="120" w:type="dxa"/>
+              <w:bottom w:w="100" w:type="dxa"/>
+              <w:end w:w="120" w:type="dxa"/>
+            </w:tcMar>
+            <w:vAlign w:val="center"/>
+          </w:tcPr>
+          <w:p>
+            <w:r>
+              <w:rPr>
+                <w:rFonts w:ascii="Aptos" w:hAnsi="Aptos"/>
+                <w:b w:val="0"/>
+                <w:i w:val="0"/>
+                <w:color w:val="0A1F44"/>
+                <w:sz w:val="19"/>
+              </w:rPr>
+              <w:t>Operator setting, 5–1440 minutes; default 30</w:t>
+            </w:r>
+          </w:p>
+        </w:tc>
+      </w:tr>
+      <w:tr>
+        <w:tc>
+          <w:tcPr>
+            <w:tcW w:type="dxa" w:w="3024"/>
+            <w:shd w:fill="FFFFFF"/>
+            <w:tcMar>
+              <w:top w:w="100" w:type="dxa"/>
+              <w:start w:w="120" w:type="dxa"/>
+              <w:bottom w:w="100" w:type="dxa"/>
+              <w:end w:w="120" w:type="dxa"/>
+            </w:tcMar>
+            <w:vAlign w:val="center"/>
+          </w:tcPr>
+          <w:p>
+            <w:r>
+              <w:rPr>
+                <w:rFonts w:ascii="Aptos" w:hAnsi="Aptos"/>
+                <w:b w:val="0"/>
+                <w:i w:val="0"/>
+                <w:color w:val="0A1F44"/>
+                <w:sz w:val="19"/>
+              </w:rPr>
+              <w:t>Login security</w:t>
+            </w:r>
+          </w:p>
+        </w:tc>
+        <w:tc>
+          <w:tcPr>
+            <w:tcW w:type="dxa" w:w="6768"/>
+            <w:shd w:fill="FFFFFF"/>
+            <w:tcMar>
+              <w:top w:w="100" w:type="dxa"/>
+              <w:start w:w="120" w:type="dxa"/>
+              <w:bottom w:w="100" w:type="dxa"/>
+              <w:end w:w="120" w:type="dxa"/>
+            </w:tcMar>
+            <w:vAlign w:val="center"/>
+          </w:tcPr>
+          <w:p>
+            <w:r>
+              <w:rPr>
+                <w:rFonts w:ascii="Aptos" w:hAnsi="Aptos"/>
+                <w:b w:val="0"/>
+                <w:i w:val="0"/>
+                <w:color w:val="0A1F44"/>
+                <w:sz w:val="19"/>
+              </w:rPr>
+              <w:t>Webmail opens only after Winlink secure-login acceptance</w:t>
+            </w:r>
+          </w:p>
+        </w:tc>
+      </w:tr>
     </w:tbl>
     <w:p>
       <w:pPr>
@@ -2714,7 +2831,7 @@
         <w:color w:val="536171"/>
         <w:sz w:val="16"/>
       </w:rPr>
-      <w:t>N0JCG Open Radio Platform  |  N0JCG Winlink Email Server v0.1.0    Page 1</w:t>
+      <w:t>N0JCG Open Radio Platform  |  N0JCG Winlink Email Server v0.1.1    Page 1</w:t>
     </w:r>
   </w:p>
 </w:ftr>

</xml_diff>

<commit_message>
Release N0JCG Winlink Email Server v0.1.2
</commit_message>
<xml_diff>
--- a/docs/N0JCG_Winlink_Email_Server_End_User_Guide.docx
+++ b/docs/N0JCG_Winlink_Email_Server_End_User_Guide.docx
@@ -226,7 +226,7 @@
                 <w:color w:val="0A1F44"/>
                 <w:sz w:val="19"/>
               </w:rPr>
-              <w:t>0.1.1</w:t>
+              <w:t>0.1.2</w:t>
             </w:r>
           </w:p>
         </w:tc>
@@ -1434,12 +1434,30 @@
         <w:pStyle w:val="Heading2"/>
       </w:pPr>
       <w:r>
+        <w:t>Find a nearby Packet RMS gateway</w:t>
+      </w:r>
+    </w:p>
+    <w:p>
+      <w:r>
+        <w:t>The Nearby RMS gateways panel uses the official Winlink gateway status data. With Internet access, select Refresh gateway list to update the local cache. The cached list remains available in the field without Internet access. The panel shows the five closest Packet RMS channels in a scrollable list. Enter simulated latitude/longitude for testing, or select Use GPS after a USB GPS receiver and gpsd are available.</w:t>
+      </w:r>
+    </w:p>
+    <w:p>
+      <w:r>
+        <w:t>Double-click a gateway row to copy its RMS target and frequency into the Packet station profile, scroll to that profile, and focus the target field. Review the values before selecting Save radio profile. The selected target applies to the next Winlink client exchange; it does not change the external gateway.</w:t>
+      </w:r>
+    </w:p>
+    <w:p>
+      <w:pPr>
+        <w:pStyle w:val="Heading2"/>
+      </w:pPr>
+      <w:r>
         <w:t>Webmail account</w:t>
       </w:r>
     </w:p>
     <w:p>
       <w:r>
-        <w:t>Open the webmail address and select Sign in with Winlink. Enter the user’s Winlink email address and secure-login password. The appliance validates the credentials against Winlink before opening the private local mailbox for that callsign. Webmail remains closed until Winlink CMS secure login is accepted; failed or timed-out authentication never opens a session or mailbox.</w:t>
+        <w:t>Open the webmail address and select Sign in with Winlink. Enter the user’s Winlink email address and secure-login password. The appliance validates the credentials against Winlink before opening the private local mailbox for that callsign. Webmail remains closed until Winlink CMS secure login is accepted; failed or timed-out authentication never opens a session or mailbox. After secure login succeeds, the session remains active for the browser session; refreshing the page does not sign the user out. Close the browser or select Log out to end the session.</w:t>
       </w:r>
     </w:p>
     <w:tbl>
@@ -1710,7 +1728,7 @@
           <w:color w:val="0A1F44"/>
           <w:sz w:val="21"/>
         </w:rPr>
-        <w:t>Use Log out when leaving a shared workstation.</w:t>
+        <w:t>Use Log out when leaving a shared workstation. Webmail uses a browser-session cookie by default; it does not remember users across browser sessions.</w:t>
       </w:r>
     </w:p>
     <w:p>
@@ -1737,6 +1755,11 @@
     <w:p>
       <w:r>
         <w:t>Queue message stages the message into Pat’s official outbox and immediately starts a Packet RMS synchronization. The Send queue shows queued, staged, and transmission state. After a successful send, the message is removed from Send queue and its counter updates automatically. The operator configures automatic mailbox synchronization in the operator console under Packet station → Automatic mailbox sync (minutes), from 5 to 1440 minutes; the default is 30 minutes.</w:t>
+      </w:r>
+    </w:p>
+    <w:p>
+      <w:r>
+        <w:t>After Pat reports the final outgoing-transfer command, WES clears the transmitted queue item promptly while the remainder of the mailbox synchronization continues. This prevents a successful send from appearing stuck while the session closes.</w:t>
       </w:r>
     </w:p>
     <w:p>
@@ -2831,7 +2854,7 @@
         <w:color w:val="536171"/>
         <w:sz w:val="16"/>
       </w:rPr>
-      <w:t>N0JCG Open Radio Platform  |  N0JCG Winlink Email Server v0.1.1    Page 1</w:t>
+      <w:t>N0JCG Open Radio Platform  |  N0JCG Winlink Email Server v0.1.2    Page 1</w:t>
     </w:r>
   </w:p>
 </w:ftr>

</xml_diff>

<commit_message>
Release N0JCG Winlink Email Server v0.1.3
</commit_message>
<xml_diff>
--- a/docs/N0JCG_Winlink_Email_Server_End_User_Guide.docx
+++ b/docs/N0JCG_Winlink_Email_Server_End_User_Guide.docx
@@ -226,7 +226,7 @@
                 <w:color w:val="0A1F44"/>
                 <w:sz w:val="19"/>
               </w:rPr>
-              <w:t>0.1.2</w:t>
+              <w:t>0.1.3</w:t>
             </w:r>
           </w:p>
         </w:tc>
@@ -1575,6 +1575,171 @@
       </w:r>
     </w:p>
     <w:p>
+      <w:pPr>
+        <w:jc w:val="center"/>
+      </w:pPr>
+      <w:r>
+        <w:drawing>
+          <wp:inline xmlns:a="http://schemas.openxmlformats.org/drawingml/2006/main" xmlns:pic="http://schemas.openxmlformats.org/drawingml/2006/picture">
+            <wp:extent cx="6217920" cy="2925715"/>
+            <wp:docPr id="3" name="Picture 3"/>
+            <wp:cNvGraphicFramePr>
+              <a:graphicFrameLocks noChangeAspect="1"/>
+            </wp:cNvGraphicFramePr>
+            <a:graphic>
+              <a:graphicData uri="http://schemas.openxmlformats.org/drawingml/2006/picture">
+                <pic:pic>
+                  <pic:nvPicPr>
+                    <pic:cNvPr id="0" name="mailbox-progress.png"/>
+                    <pic:cNvPicPr/>
+                  </pic:nvPicPr>
+                  <pic:blipFill>
+                    <a:blip r:embed="rId15"/>
+                    <a:stretch>
+                      <a:fillRect/>
+                    </a:stretch>
+                  </pic:blipFill>
+                  <pic:spPr>
+                    <a:xfrm>
+                      <a:off x="0" y="0"/>
+                      <a:ext cx="6217920" cy="2925715"/>
+                    </a:xfrm>
+                    <a:prstGeom prst="rect"/>
+                  </pic:spPr>
+                </pic:pic>
+              </a:graphicData>
+            </a:graphic>
+          </wp:inline>
+        </w:drawing>
+      </w:r>
+    </w:p>
+    <w:p>
+      <w:pPr>
+        <w:spacing w:after="160"/>
+        <w:jc w:val="center"/>
+      </w:pPr>
+      <w:r>
+        <w:rPr>
+          <w:rFonts w:ascii="Aptos" w:hAnsi="Aptos"/>
+          <w:b w:val="0"/>
+          <w:i/>
+          <w:color w:val="536171"/>
+          <w:sz w:val="17"/>
+        </w:rPr>
+        <w:t>Figure 2. Webmail shows the authenticated mailbox and current synchronization state while a Packet RMS transfer is in progress.</w:t>
+      </w:r>
+    </w:p>
+    <w:p>
+      <w:pPr>
+        <w:jc w:val="center"/>
+      </w:pPr>
+      <w:r>
+        <w:drawing>
+          <wp:inline xmlns:a="http://schemas.openxmlformats.org/drawingml/2006/main" xmlns:pic="http://schemas.openxmlformats.org/drawingml/2006/picture">
+            <wp:extent cx="6217920" cy="4528485"/>
+            <wp:docPr id="4" name="Picture 4"/>
+            <wp:cNvGraphicFramePr>
+              <a:graphicFrameLocks noChangeAspect="1"/>
+            </wp:cNvGraphicFramePr>
+            <a:graphic>
+              <a:graphicData uri="http://schemas.openxmlformats.org/drawingml/2006/picture">
+                <pic:pic>
+                  <pic:nvPicPr>
+                    <pic:cNvPr id="0" name="operator-status.png"/>
+                    <pic:cNvPicPr/>
+                  </pic:nvPicPr>
+                  <pic:blipFill>
+                    <a:blip r:embed="rId16"/>
+                    <a:stretch>
+                      <a:fillRect/>
+                    </a:stretch>
+                  </pic:blipFill>
+                  <pic:spPr>
+                    <a:xfrm>
+                      <a:off x="0" y="0"/>
+                      <a:ext cx="6217920" cy="4528485"/>
+                    </a:xfrm>
+                    <a:prstGeom prst="rect"/>
+                  </pic:spPr>
+                </pic:pic>
+              </a:graphicData>
+            </a:graphic>
+          </wp:inline>
+        </w:drawing>
+      </w:r>
+    </w:p>
+    <w:p>
+      <w:pPr>
+        <w:spacing w:after="160"/>
+        <w:jc w:val="center"/>
+      </w:pPr>
+      <w:r>
+        <w:rPr>
+          <w:rFonts w:ascii="Aptos" w:hAnsi="Aptos"/>
+          <w:b w:val="0"/>
+          <w:i/>
+          <w:color w:val="536171"/>
+          <w:sz w:val="17"/>
+        </w:rPr>
+        <w:t>Figure 3. Operator status separates device detection, service readiness, RF state, and the transmit safety policy.</w:t>
+      </w:r>
+    </w:p>
+    <w:p>
+      <w:pPr>
+        <w:jc w:val="center"/>
+      </w:pPr>
+      <w:r>
+        <w:drawing>
+          <wp:inline xmlns:a="http://schemas.openxmlformats.org/drawingml/2006/main" xmlns:pic="http://schemas.openxmlformats.org/drawingml/2006/picture">
+            <wp:extent cx="6217920" cy="3068973"/>
+            <wp:docPr id="5" name="Picture 5"/>
+            <wp:cNvGraphicFramePr>
+              <a:graphicFrameLocks noChangeAspect="1"/>
+            </wp:cNvGraphicFramePr>
+            <a:graphic>
+              <a:graphicData uri="http://schemas.openxmlformats.org/drawingml/2006/picture">
+                <pic:pic>
+                  <pic:nvPicPr>
+                    <pic:cNvPr id="0" name="operator-diagnostics.png"/>
+                    <pic:cNvPicPr/>
+                  </pic:nvPicPr>
+                  <pic:blipFill>
+                    <a:blip r:embed="rId17"/>
+                    <a:stretch>
+                      <a:fillRect/>
+                    </a:stretch>
+                  </pic:blipFill>
+                  <pic:spPr>
+                    <a:xfrm>
+                      <a:off x="0" y="0"/>
+                      <a:ext cx="6217920" cy="3068973"/>
+                    </a:xfrm>
+                    <a:prstGeom prst="rect"/>
+                  </pic:spPr>
+                </pic:pic>
+              </a:graphicData>
+            </a:graphic>
+          </wp:inline>
+        </w:drawing>
+      </w:r>
+    </w:p>
+    <w:p>
+      <w:pPr>
+        <w:spacing w:after="160"/>
+        <w:jc w:val="center"/>
+      </w:pPr>
+      <w:r>
+        <w:rPr>
+          <w:rFonts w:ascii="Aptos" w:hAnsi="Aptos"/>
+          <w:b w:val="0"/>
+          <w:i/>
+          <w:color w:val="536171"/>
+          <w:sz w:val="17"/>
+        </w:rPr>
+        <w:t>Figure 4. Operator diagnostics provides a safe pre-radio checklist and a clear next action.</w:t>
+      </w:r>
+    </w:p>
+    <w:p>
       <w:r>
         <w:br w:type="page"/>
       </w:r>
@@ -1608,7 +1773,7 @@
         <w:drawing>
           <wp:inline xmlns:a="http://schemas.openxmlformats.org/drawingml/2006/main" xmlns:pic="http://schemas.openxmlformats.org/drawingml/2006/picture">
             <wp:extent cx="6217920" cy="2678867"/>
-            <wp:docPr id="3" name="Picture 3"/>
+            <wp:docPr id="6" name="Picture 6"/>
             <wp:cNvGraphicFramePr>
               <a:graphicFrameLocks noChangeAspect="1"/>
             </wp:cNvGraphicFramePr>
@@ -1620,7 +1785,7 @@
                     <pic:cNvPicPr/>
                   </pic:nvPicPr>
                   <pic:blipFill>
-                    <a:blip r:embed="rId15"/>
+                    <a:blip r:embed="rId18"/>
                     <a:stretch>
                       <a:fillRect/>
                     </a:stretch>
@@ -1652,7 +1817,7 @@
           <w:color w:val="536171"/>
           <w:sz w:val="17"/>
         </w:rPr>
-        <w:t>Figure 2. New message panel with attachment controls and the N0JCG navigation shell.</w:t>
+        <w:t>Figure 5. Compose panel with attachment controls and the N0JCG navigation shell.</w:t>
       </w:r>
     </w:p>
     <w:p>
@@ -1760,6 +1925,24 @@
     <w:p>
       <w:r>
         <w:t>After Pat reports the final outgoing-transfer command, WES clears the transmitted queue item promptly while the remainder of the mailbox synchronization continues. This prevents a successful send from appearing stuck while the session closes.</w:t>
+      </w:r>
+    </w:p>
+    <w:p>
+      <w:pPr>
+        <w:pStyle w:val="Heading2"/>
+      </w:pPr>
+      <w:r>
+        <w:t>Mailbox synchronization progress</w:t>
+      </w:r>
+    </w:p>
+    <w:p>
+      <w:r>
+        <w:t>After Winlink secure login is accepted, WES opens the webmail session and continues the mailbox transfer in the background. The status message advances through the RMS connection, mailbox index, proposal, message selection, download, and finalization stages. A message such as 0 new emails were received means the authenticated mailbox was checked and no new messages were available in that exchange. The Refresh control is disabled while a transfer is active so an operator cannot interrupt the current RF session.</w:t>
+      </w:r>
+    </w:p>
+    <w:p>
+      <w:r>
+        <w:t>If the radio session closes after one or more messages have been received, WES records the received messages and clears the stale in-progress state. A transport failure after authentication does not expose another user’s mailbox and does not invalidate the logged-in callsign unless authentication itself has been lost.</w:t>
       </w:r>
     </w:p>
     <w:p>
@@ -2105,6 +2288,32 @@
     <w:p>
       <w:r>
         <w:t>This means the Winlink account was authenticated, but the local mailbox service is not currently available. It is not a request for the user to type a command. Connect the radio and select Refresh to start a mailbox synchronization. If the message persists, the operator should review the client service and diagnostics.</w:t>
+      </w:r>
+    </w:p>
+    <w:p>
+      <w:pPr>
+        <w:pStyle w:val="Heading2"/>
+      </w:pPr>
+      <w:r>
+        <w:t>Local delete versus Winlink Webmail</w:t>
+      </w:r>
+    </w:p>
+    <w:p>
+      <w:r>
+        <w:t>The WES Inbox, folders, and delete actions manage the local appliance mailbox. Winlink Webmail is a separate CMS view and may continue to show the same server-side message after WES downloads or locally deletes it. Remove a message separately through Winlink Webmail when server-side retention also needs to change.</w:t>
+      </w:r>
+    </w:p>
+    <w:p>
+      <w:pPr>
+        <w:pStyle w:val="Heading2"/>
+      </w:pPr>
+      <w:r>
+        <w:t>A previous RF session is still active</w:t>
+      </w:r>
+    </w:p>
+    <w:p>
+      <w:r>
+        <w:t>Only one mailbox user and one RF session are allowed at a time. A new login terminates the previous session, releases the Pat/AGW connection, and allows the radio path to settle before starting again. After a failed exchange, wait for the visible failure state and the RF activity to stop before retrying. The operator diagnostics show the last client/RF event.</w:t>
       </w:r>
     </w:p>
     <w:p>
@@ -2854,7 +3063,7 @@
         <w:color w:val="536171"/>
         <w:sz w:val="16"/>
       </w:rPr>
-      <w:t>N0JCG Open Radio Platform  |  N0JCG Winlink Email Server v0.1.2    Page 1</w:t>
+      <w:t>N0JCG Open Radio Platform  |  N0JCG Winlink Email Server v0.1.3    Page 1</w:t>
     </w:r>
   </w:p>
 </w:ftr>

</xml_diff>

<commit_message>
Release Winlink Email Server v0.1.4
</commit_message>
<xml_diff>
--- a/docs/N0JCG_Winlink_Email_Server_End_User_Guide.docx
+++ b/docs/N0JCG_Winlink_Email_Server_End_User_Guide.docx
@@ -226,7 +226,7 @@
                 <w:color w:val="0A1F44"/>
                 <w:sz w:val="19"/>
               </w:rPr>
-              <w:t>0.1.3</w:t>
+              <w:t>0.1.4</w:t>
             </w:r>
           </w:p>
         </w:tc>
@@ -1581,8 +1581,63 @@
       <w:r>
         <w:drawing>
           <wp:inline xmlns:a="http://schemas.openxmlformats.org/drawingml/2006/main" xmlns:pic="http://schemas.openxmlformats.org/drawingml/2006/picture">
+            <wp:extent cx="6217920" cy="3886200"/>
+            <wp:docPr id="3" name="Picture 3"/>
+            <wp:cNvGraphicFramePr>
+              <a:graphicFrameLocks noChangeAspect="1"/>
+            </wp:cNvGraphicFramePr>
+            <a:graphic>
+              <a:graphicData uri="http://schemas.openxmlformats.org/drawingml/2006/picture">
+                <pic:pic>
+                  <pic:nvPicPr>
+                    <pic:cNvPr id="0" name="webmail-signin-v0.1.4.png"/>
+                    <pic:cNvPicPr/>
+                  </pic:nvPicPr>
+                  <pic:blipFill>
+                    <a:blip r:embed="rId15"/>
+                    <a:stretch>
+                      <a:fillRect/>
+                    </a:stretch>
+                  </pic:blipFill>
+                  <pic:spPr>
+                    <a:xfrm>
+                      <a:off x="0" y="0"/>
+                      <a:ext cx="6217920" cy="3886200"/>
+                    </a:xfrm>
+                    <a:prstGeom prst="rect"/>
+                  </pic:spPr>
+                </pic:pic>
+              </a:graphicData>
+            </a:graphic>
+          </wp:inline>
+        </w:drawing>
+      </w:r>
+    </w:p>
+    <w:p>
+      <w:pPr>
+        <w:spacing w:after="160"/>
+        <w:jc w:val="center"/>
+      </w:pPr>
+      <w:r>
+        <w:rPr>
+          <w:rFonts w:ascii="Aptos" w:hAnsi="Aptos"/>
+          <w:b w:val="0"/>
+          <w:i/>
+          <w:color w:val="536171"/>
+          <w:sz w:val="17"/>
+        </w:rPr>
+        <w:t>Figure 2. Current N0JCG Winlink webmail sign-in surface.</w:t>
+      </w:r>
+    </w:p>
+    <w:p>
+      <w:pPr>
+        <w:jc w:val="center"/>
+      </w:pPr>
+      <w:r>
+        <w:drawing>
+          <wp:inline xmlns:a="http://schemas.openxmlformats.org/drawingml/2006/main" xmlns:pic="http://schemas.openxmlformats.org/drawingml/2006/picture">
             <wp:extent cx="6217920" cy="2925715"/>
-            <wp:docPr id="3" name="Picture 3"/>
+            <wp:docPr id="4" name="Picture 4"/>
             <wp:cNvGraphicFramePr>
               <a:graphicFrameLocks noChangeAspect="1"/>
             </wp:cNvGraphicFramePr>
@@ -1594,7 +1649,7 @@
                     <pic:cNvPicPr/>
                   </pic:nvPicPr>
                   <pic:blipFill>
-                    <a:blip r:embed="rId15"/>
+                    <a:blip r:embed="rId16"/>
                     <a:stretch>
                       <a:fillRect/>
                     </a:stretch>
@@ -1637,7 +1692,7 @@
         <w:drawing>
           <wp:inline xmlns:a="http://schemas.openxmlformats.org/drawingml/2006/main" xmlns:pic="http://schemas.openxmlformats.org/drawingml/2006/picture">
             <wp:extent cx="6217920" cy="4528485"/>
-            <wp:docPr id="4" name="Picture 4"/>
+            <wp:docPr id="5" name="Picture 5"/>
             <wp:cNvGraphicFramePr>
               <a:graphicFrameLocks noChangeAspect="1"/>
             </wp:cNvGraphicFramePr>
@@ -1649,7 +1704,7 @@
                     <pic:cNvPicPr/>
                   </pic:nvPicPr>
                   <pic:blipFill>
-                    <a:blip r:embed="rId16"/>
+                    <a:blip r:embed="rId17"/>
                     <a:stretch>
                       <a:fillRect/>
                     </a:stretch>
@@ -1692,7 +1747,7 @@
         <w:drawing>
           <wp:inline xmlns:a="http://schemas.openxmlformats.org/drawingml/2006/main" xmlns:pic="http://schemas.openxmlformats.org/drawingml/2006/picture">
             <wp:extent cx="6217920" cy="3068973"/>
-            <wp:docPr id="5" name="Picture 5"/>
+            <wp:docPr id="6" name="Picture 6"/>
             <wp:cNvGraphicFramePr>
               <a:graphicFrameLocks noChangeAspect="1"/>
             </wp:cNvGraphicFramePr>
@@ -1704,7 +1759,7 @@
                     <pic:cNvPicPr/>
                   </pic:nvPicPr>
                   <pic:blipFill>
-                    <a:blip r:embed="rId17"/>
+                    <a:blip r:embed="rId18"/>
                     <a:stretch>
                       <a:fillRect/>
                     </a:stretch>
@@ -1773,7 +1828,7 @@
         <w:drawing>
           <wp:inline xmlns:a="http://schemas.openxmlformats.org/drawingml/2006/main" xmlns:pic="http://schemas.openxmlformats.org/drawingml/2006/picture">
             <wp:extent cx="6217920" cy="2678867"/>
-            <wp:docPr id="6" name="Picture 6"/>
+            <wp:docPr id="7" name="Picture 7"/>
             <wp:cNvGraphicFramePr>
               <a:graphicFrameLocks noChangeAspect="1"/>
             </wp:cNvGraphicFramePr>
@@ -1785,7 +1840,7 @@
                     <pic:cNvPicPr/>
                   </pic:nvPicPr>
                   <pic:blipFill>
-                    <a:blip r:embed="rId18"/>
+                    <a:blip r:embed="rId19"/>
                     <a:stretch>
                       <a:fillRect/>
                     </a:stretch>
@@ -3063,7 +3118,7 @@
         <w:color w:val="536171"/>
         <w:sz w:val="16"/>
       </w:rPr>
-      <w:t>N0JCG Open Radio Platform  |  N0JCG Winlink Email Server v0.1.3    Page 1</w:t>
+      <w:t>N0JCG Open Radio Platform  |  N0JCG Winlink Email Server v0.1.4    Page 1</w:t>
     </w:r>
   </w:p>
 </w:ftr>

</xml_diff>

<commit_message>
Release Winlink Email Server v0.1.5
</commit_message>
<xml_diff>
--- a/docs/N0JCG_Winlink_Email_Server_End_User_Guide.docx
+++ b/docs/N0JCG_Winlink_Email_Server_End_User_Guide.docx
@@ -226,7 +226,7 @@
                 <w:color w:val="0A1F44"/>
                 <w:sz w:val="19"/>
               </w:rPr>
-              <w:t>0.1.4</w:t>
+              <w:t>0.1.5</w:t>
             </w:r>
           </w:p>
         </w:tc>
@@ -3118,7 +3118,7 @@
         <w:color w:val="536171"/>
         <w:sz w:val="16"/>
       </w:rPr>
-      <w:t>N0JCG Open Radio Platform  |  N0JCG Winlink Email Server v0.1.4    Page 1</w:t>
+      <w:t>N0JCG Open Radio Platform  |  N0JCG Winlink Email Server v0.1.5    Page 1</w:t>
     </w:r>
   </w:p>
 </w:ftr>

</xml_diff>

<commit_message>
Release Winlink Email Server v0.1.6
</commit_message>
<xml_diff>
--- a/docs/N0JCG_Winlink_Email_Server_End_User_Guide.docx
+++ b/docs/N0JCG_Winlink_Email_Server_End_User_Guide.docx
@@ -226,7 +226,7 @@
                 <w:color w:val="0A1F44"/>
                 <w:sz w:val="19"/>
               </w:rPr>
-              <w:t>0.1.5</w:t>
+              <w:t>0.1.6</w:t>
             </w:r>
           </w:p>
         </w:tc>
@@ -3118,7 +3118,7 @@
         <w:color w:val="536171"/>
         <w:sz w:val="16"/>
       </w:rPr>
-      <w:t>N0JCG Open Radio Platform  |  N0JCG Winlink Email Server v0.1.5    Page 1</w:t>
+      <w:t>N0JCG Open Radio Platform  |  N0JCG Winlink Email Server v0.1.6    Page 1</w:t>
     </w:r>
   </w:p>
 </w:ftr>

</xml_diff>